<commit_message>
Deepen final round solution and demo
</commit_message>
<xml_diff>
--- a/提交材料/08_40强赛完整参赛方案.docx
+++ b/提交材料/08_40强赛完整参赛方案.docx
@@ -515,7 +515,7 @@
         <w:pStyle w:val="BodyText"/>
       </w:pPr>
       <w:r>
-        <w:t xml:space="preserve">赛力斯超级工厂正迈向高度自动化与智能化。面向高精度新能源汽车制造，质量风险不只来自最终检验结果，而是更早隐藏在设备状态、工艺过程、参数波动、零件批次、维修记录和人员处置链路中。公开资料显示，赛力斯已围绕全过程质量数据采集、异常特征提取、控线、异常设备定位和一车一档形成较强基础。决赛方案的重点不是再次证明“数据可以采集”，而是进一步解决“数据如何转化为主动质量行动”。</w:t>
+        <w:t xml:space="preserve">赛力斯超级工厂已具备高度自动化、数字化和智能检测基础。公开资料显示，工厂拥有大规模机器人与智能化设备协同，关键工序高度自动化，质量自动化管理系统能够完成全过程质量数据采集、异常特征提取、控线、异常设备定位、快速追溯和一车一档沉淀。华为智慧园区案例进一步显示，园区网络、AIoT检测点、云和数据资产汇聚为现场信号进入协同流程提供了条件。由此可见，本命题的关键不是从零建设数据采集系统，而是把既有数据能力转化为主动质量行动。</w:t>
       </w:r>
     </w:p>
     <w:p>
@@ -528,7 +528,7 @@
         <w:pStyle w:val="BodyText"/>
       </w:pPr>
       <w:r>
-        <w:t xml:space="preserve">传统工业知识图谱与智能体应用常见三类断点。第一是发现断点：系统等待人员查询，难以主动识别扭矩、电流、温度、模温差等参数的异常趋势。第二是解释断点：报警记录只能说明发生了什么，无法稳定回答为什么严重、影响哪些车辆、证据来自哪里。第三是执行断点：分析结论停留在报告或群聊中，责任人、时限、复检、维修、关闭和复盘没有形成结构化闭环。</w:t>
+        <w:t xml:space="preserve">新能源汽车制造质量风险具有多源、多跳、跨岗位和滞后暴露特征。总装拧紧异常可能同时关联拧紧枪校准、套筒磨损、角度补偿、VIN时间窗、FMEA条目和复检规范；焊装焊点异常可能关联电极帽寿命、二次回路接触电阻、焊核直径和结构强度；涂装烘干异常可能关联风门、温控回路、膜厚和附着力；一体化压铸异常可能关联冷却水路、模温差、X光缩孔和尺寸稳定性。单一报警或单一看板难以解释这些链式关系。</w:t>
       </w:r>
     </w:p>
     <w:p>
@@ -541,24 +541,7 @@
         <w:pStyle w:val="BodyText"/>
       </w:pPr>
       <w:r>
-        <w:t xml:space="preserve">新能源汽车制造质量风险天然具有多跳关系。总装拧紧风险可能关联拧紧枪校准、套筒磨损、角度补偿、VIN时间窗、FMEA条目和复检规范；焊装焊点风险可能关联电极帽寿命、二次回路接触电阻、焊核直径和车身结构强度；涂装烘干风险可能关联风门、温控回路、膜厚和附着力；压铸冷却风险可能关联冷却水路、模温差、X光缩孔和尺寸稳定性。因此，方案必须从单点报警升级为设备-过程-质量的证据推理闭环。</w:t>
-      </w:r>
-    </w:p>
-    <w:p>
-      <w:r>
-        <w:t xml:space="preserve"/>
-      </w:r>
-    </w:p>
-    <w:p>
-      <w:r>
-        <w:rPr>
-          <w:b/>
-          <w:color w:val="1F4D78"/>
-        </w:rPr>
-        <w:t xml:space="preserve">业务流程可概括为：</w:t>
-      </w:r>
-      <w:r>
-        <w:t xml:space="preserve">现场信号进入事件流，知识图谱组织上下文，GraphRAG生成证据链，Agent编排处置任务，飞书承接协同执行，关闭结果回写知识底座。</w:t>
+        <w:t xml:space="preserve">现场痛点集中在三类断点。第一是发现断点：系统可以记录报警，却不一定能主动识别连续趋势、同工位复现、同设备重复和批次影响。第二是解释断点：报警能说明发生了什么，但很难稳定回答为什么严重、影响哪些车辆或零件、证据来自哪些系统。第三是执行断点：分析结论停留在报告或群聊中，责任人、时限、复检、维修、关闭和复盘没有形成结构化闭环。知质·灵巡正是围绕这三个断点设计。</w:t>
       </w:r>
     </w:p>
     <w:p>
@@ -585,7 +568,7 @@
         <w:pStyle w:val="BodyText"/>
       </w:pPr>
       <w:r>
-        <w:t xml:space="preserve">方案命名为“知质·灵巡”。它不是被动问答助手，而是一名设备质量风险主动管控数字员工。整体方案由“一套知识底座、一名数字员工、一条协同闭环”构成。</w:t>
+        <w:t xml:space="preserve">方案命名为“知质·灵巡”。它是一名面向设备质量风险的主动管控数字员工，由“一套知识底座、一套推理链路、一套协同闭环”构成。</w:t>
       </w:r>
     </w:p>
     <w:p>
@@ -611,24 +594,20 @@
         <w:pStyle w:val="BodyText"/>
       </w:pPr>
       <w:r>
-        <w:t xml:space="preserve">一名数字员工：由Autonomous Agent执行“观察-研判-检索-推理-行动-复盘”循环。当设备报警或参数波动出现时，它主动识别风险等级、圈定影响范围、生成根因假设、组织证据链并编排处置任务。</w:t>
-      </w:r>
-    </w:p>
-    <w:p>
-      <w:r>
-        <w:t xml:space="preserve"/>
-      </w:r>
-    </w:p>
-    <w:p>
-      <w:r>
-        <w:rPr>
-          <w:b/>
-          <w:color w:val="1F4D78"/>
-        </w:rPr>
-        <w:t xml:space="preserve">一条协同闭环：</w:t>
-      </w:r>
-      <w:r>
-        <w:t xml:space="preserve">飞书Aily作为自然语言入口，多维表格承载事件与任务，自定义机器人推送风险卡片，班组在飞书内更新进度，关闭后将根因、措施、复检结果和规则调整回写知识图谱。</w:t>
+        <w:t xml:space="preserve">一套推理链路：当现场事件进入系统后，先由规则和统计信号识别异常，再由GraphRAG沿图谱路径检索FMEA、SOP、维修记录、质检规范和历史案例，最后由Agent生成风险等级、影响范围、根因Top-K、证据链和处置任务。</w:t>
+      </w:r>
+    </w:p>
+    <w:p>
+      <w:r>
+        <w:t xml:space="preserve"/>
+      </w:r>
+    </w:p>
+    <w:p>
+      <w:pPr>
+        <w:pStyle w:val="BodyText"/>
+      </w:pPr>
+      <w:r>
+        <w:t xml:space="preserve">一套协同闭环：飞书Aily承接自然语言查询，多维表格承载质量事件、处置任务、复检记录、设备维修和知识回写，自定义机器人把P1/P2风险推送到对应群组。在线凭证接入前，项目已保留字段映射和接口封装；凭证接入后即可写入指定多维表格并推送机器人卡片。</w:t>
       </w:r>
     </w:p>
     <w:p>
@@ -672,7 +651,7 @@
         </w:numPr>
       </w:pPr>
       <w:r>
-        <w:t xml:space="preserve">数据接入层：接入MES过站、QMS缺陷、SCADA/PLC设备告警、视觉检测、X光检测、设备点检、维修工单、FMEA、控制计划和飞书任务状态。</w:t>
+        <w:t xml:space="preserve">数据接入层：接入MES过站、QMS缺陷、SCADA/PLC设备报警、视觉检测、X光检测、设备点检、维修工单、FMEA、控制计划和飞书任务状态。</w:t>
       </w:r>
     </w:p>
     <w:p>
@@ -708,7 +687,7 @@
         </w:numPr>
       </w:pPr>
       <w:r>
-        <w:t xml:space="preserve">GraphRAG推理层：沿图谱路径检索FMEA、SOP、维修记录、质检规范和历史8D，形成“参数异常-质量风险-根因假设-处置依据”的证据链。</w:t>
+        <w:t xml:space="preserve">GraphRAG推理层：沿图谱路径检索FMEA、SOP、维修记录、质检规范和历史ID，形成“参数异常-质量风险-根因假设-处置依据”的证据链。</w:t>
       </w:r>
     </w:p>
     <w:p>
@@ -867,7 +846,7 @@
         <w:pStyle w:val="BodyText"/>
       </w:pPr>
       <w:r>
-        <w:t xml:space="preserve">赛力斯已有一车一档基础，方案进一步将其升级为质量推理载体。每辆受影响车辆都能说明经过哪个工位、受到哪个设备或参数影响、依据哪些证据处置、关闭条件是什么。这使质量追溯从档案查询升级为主动管控。</w:t>
+        <w:t xml:space="preserve">赛力斯已有一车一档基础，方案进一步将其升级为质量推理载体。每辆受影响车辆都能说明经过哪个工位、受到哪个设备或参数影响、依据哪些证据处置、关闭条件是什么。质量追溯从档案查询升级为主动管控。</w:t>
       </w:r>
     </w:p>
     <w:p>
@@ -894,7 +873,7 @@
         <w:pStyle w:val="BodyText"/>
       </w:pPr>
       <w:r>
-        <w:t xml:space="preserve">方案中的AI不是附着在边角流程上的文本总结，而是进入质量管控核心链路。</w:t>
+        <w:t xml:space="preserve">方案中的AI进入质量管控核心链路，而不是附着在边角流程上的文本总结。</w:t>
       </w:r>
     </w:p>
     <w:p>
@@ -1072,7 +1051,60 @@
         <w:keepNext/>
       </w:pPr>
       <w:r>
-        <w:t xml:space="preserve">八、业务价值与量化收益</w:t>
+        <w:t xml:space="preserve">八、互动工作台成果</w:t>
+      </w:r>
+    </w:p>
+    <w:p>
+      <w:r>
+        <w:t xml:space="preserve"/>
+      </w:r>
+    </w:p>
+    <w:p>
+      <w:pPr>
+        <w:pStyle w:val="BodyText"/>
+      </w:pPr>
+      <w:r>
+        <w:t xml:space="preserve">项目已形成可直接打开的互动工作台，入口为`app/index.html`。工作台不是静态说明页，而是围绕四类典型工况进行事件注入和闭环演示。</w:t>
+      </w:r>
+    </w:p>
+    <w:p>
+      <w:r>
+        <w:t xml:space="preserve"/>
+      </w:r>
+    </w:p>
+    <w:p>
+      <w:pPr>
+        <w:pStyle w:val="BodyText"/>
+      </w:pPr>
+      <w:r>
+        <w:t xml:space="preserve">工作台包含六个关键视图。第一，企业现场基础视图展示机器人协同、关键工序自动化、一车一档和AI检测场景等公开依据。第二，仿真工况列表覆盖总装拧紧、焊装点焊、涂装烘干和压铸冷却。第三，数字员工窗口支持追问风险升级原因、影响VIN、证据链、飞书任务和复盘逻辑。第四，GraphRAG证据链显示图谱路径与证据列表。第五，风险因子拆解显示工艺窗口、时空模式、质量影响和知识命中。第六，行动时间线展示从主动捕捉、图谱定位、证据生成、任务派发到复盘回写的闭环。</w:t>
+      </w:r>
+    </w:p>
+    <w:p>
+      <w:r>
+        <w:t xml:space="preserve"/>
+      </w:r>
+    </w:p>
+    <w:p>
+      <w:pPr>
+        <w:pStyle w:val="BodyText"/>
+      </w:pPr>
+      <w:r>
+        <w:t xml:space="preserve">工作台还输出多维表格记录样例，字段包括事件ID、风险等级、设备、工位、异常参数、工艺窗口、影响范围、根因假设、处置决策、证据链、责任任务数、任务状态、Aily入口和机器人卡片内容。这样即使在线飞书凭证暂未接入，也能清晰展示接入后的数据结构和业务流向。</w:t>
+      </w:r>
+    </w:p>
+    <w:p>
+      <w:r>
+        <w:t xml:space="preserve"/>
+      </w:r>
+    </w:p>
+    <w:p>
+      <w:pPr>
+        <w:pStyle w:val="Heading1"/>
+        <w:keepNext/>
+      </w:pPr>
+      <w:r>
+        <w:t xml:space="preserve">九、业务价值与量化收益</w:t>
       </w:r>
     </w:p>
     <w:p>
@@ -1544,7 +1576,7 @@
         <w:keepNext/>
       </w:pPr>
       <w:r>
-        <w:t xml:space="preserve">九、落地可行性与推广路径</w:t>
+        <w:t xml:space="preserve">十、落地可行性与推广路径</w:t>
       </w:r>
     </w:p>
     <w:p>
@@ -1637,20 +1669,7 @@
         <w:keepNext/>
       </w:pPr>
       <w:r>
-        <w:t xml:space="preserve">十、成果物与材料链接</w:t>
-      </w:r>
-    </w:p>
-    <w:p>
-      <w:r>
-        <w:t xml:space="preserve"/>
-      </w:r>
-    </w:p>
-    <w:p>
-      <w:pPr>
-        <w:pStyle w:val="BodyText"/>
-      </w:pPr>
-      <w:r>
-        <w:t xml:space="preserve">本项目已形成可运行工作台、结构化数据样例、知识图谱样例、飞书字段设计、完整案例文档和GitHub公开仓库。</w:t>
+        <w:t xml:space="preserve">十一、成果物与材料链接</w:t>
       </w:r>
     </w:p>
     <w:p>
@@ -1731,7 +1750,7 @@
           </w:tcPr>
           <w:p>
             <w:r>
-              <w:t xml:space="preserve">交互工作台</w:t>
+              <w:t xml:space="preserve">互动工作台</w:t>
             </w:r>
           </w:p>
         </w:tc>
@@ -1747,7 +1766,7 @@
           </w:tcPr>
           <w:p>
             <w:r>
-              <w:t xml:space="preserve">`app/index.html`，支持异常注入、数字员工对话、证据链、任务看板和多维表格记录展示</w:t>
+              <w:t xml:space="preserve">`app/index.html`，支持异常注入、数字员工对话、证据链、任务看板、多维表格记录和资料依据展示</w:t>
             </w:r>
           </w:p>
         </w:tc>
@@ -1883,7 +1902,7 @@
           </w:tcPr>
           <w:p>
             <w:r>
-              <w:t xml:space="preserve">`提交材料/00-08` 文档，覆盖报名文本、开题报告、方案书、案例、创新点和决赛完整方案</w:t>
+              <w:t xml:space="preserve">`提交材料/00-08` 文档，覆盖报名文本、开题报告、方案书、案例、创新点和完整参赛方案</w:t>
             </w:r>
           </w:p>
         </w:tc>
@@ -1925,24 +1944,48 @@
         <w:keepNext/>
       </w:pPr>
       <w:r>
-        <w:t xml:space="preserve">十一、参考资料</w:t>
-      </w:r>
-    </w:p>
-    <w:p>
-      <w:r>
-        <w:t xml:space="preserve"/>
-      </w:r>
-    </w:p>
-    <w:p>
-      <w:pPr>
-        <w:pStyle w:val="ListParagraph"/>
-        <w:numPr>
-          <w:ilvl w:val="0"/>
-          <w:numId w:val="2"/>
-        </w:numPr>
-      </w:pPr>
-      <w:r>
-        <w:t xml:space="preserve">新华网：《赛力斯超级工厂树立行业标杆 以智能制造加速发展新质生产力》。</w:t>
+        <w:t xml:space="preserve">十二、参考资料</w:t>
+      </w:r>
+    </w:p>
+    <w:p>
+      <w:r>
+        <w:t xml:space="preserve"/>
+      </w:r>
+    </w:p>
+    <w:p>
+      <w:pPr>
+        <w:pStyle w:val="ListParagraph"/>
+        <w:numPr>
+          <w:ilvl w:val="0"/>
+          <w:numId w:val="2"/>
+        </w:numPr>
+      </w:pPr>
+      <w:r>
+        <w:t xml:space="preserve">新华网：《赛力斯超级工厂树立行业标杆 以智能制造加速发展新质生产力》，2024-12-18。</w:t>
+      </w:r>
+    </w:p>
+    <w:p>
+      <w:pPr>
+        <w:pStyle w:val="ListParagraph"/>
+        <w:numPr>
+          <w:ilvl w:val="0"/>
+          <w:numId w:val="2"/>
+        </w:numPr>
+      </w:pPr>
+      <w:r>
+        <w:t xml:space="preserve">新华网：《赛力斯超级工厂建成投用 重庆打造万亿级产业集群再添“硬核力量”》，2024-02-06。</w:t>
+      </w:r>
+    </w:p>
+    <w:p>
+      <w:pPr>
+        <w:pStyle w:val="ListParagraph"/>
+        <w:numPr>
+          <w:ilvl w:val="0"/>
+          <w:numId w:val="2"/>
+        </w:numPr>
+      </w:pPr>
+      <w:r>
+        <w:t xml:space="preserve">新华网：《赛力斯持续高强度研发投入 智能制造持续赋能》，2025-04-01。</w:t>
       </w:r>
     </w:p>
     <w:p>
@@ -1966,79 +2009,67 @@
         </w:numPr>
       </w:pPr>
       <w:r>
-        <w:t xml:space="preserve">华为数字能源：《赛力斯超级工厂的“超级大脑”》。</w:t>
-      </w:r>
-    </w:p>
-    <w:p>
-      <w:pPr>
-        <w:pStyle w:val="ListParagraph"/>
-        <w:numPr>
-          <w:ilvl w:val="0"/>
-          <w:numId w:val="2"/>
-        </w:numPr>
-      </w:pPr>
-      <w:r>
-        <w:t xml:space="preserve">飞书开放平台：多维表格记录接口、自定义机器人、Aily相关资料。</w:t>
-      </w:r>
-    </w:p>
-    <w:p>
-      <w:pPr>
-        <w:pStyle w:val="ListParagraph"/>
-        <w:numPr>
-          <w:ilvl w:val="0"/>
-          <w:numId w:val="2"/>
-        </w:numPr>
-      </w:pPr>
-      <w:r>
-        <w:t xml:space="preserve">Interactive and Intelligent Root Cause Analysis in Manufacturing Processes。</w:t>
-      </w:r>
-    </w:p>
-    <w:p>
-      <w:pPr>
-        <w:pStyle w:val="ListParagraph"/>
-        <w:numPr>
-          <w:ilvl w:val="0"/>
-          <w:numId w:val="2"/>
-        </w:numPr>
-      </w:pPr>
-      <w:r>
-        <w:t xml:space="preserve">Document GraphRAG: Knowledge Graph Enhanced Retrieval Augmented Generation for Document Question Answering Within the Manufacturing Domain。</w:t>
-      </w:r>
-    </w:p>
-    <w:p>
-      <w:pPr>
-        <w:pStyle w:val="ListParagraph"/>
-        <w:numPr>
-          <w:ilvl w:val="0"/>
-          <w:numId w:val="2"/>
-        </w:numPr>
-      </w:pPr>
-      <w:r>
-        <w:t xml:space="preserve">An Intelligent Quality Control Method for Manufacturing Processes Based on a Human-Cyber-Physical Knowledge Graph。</w:t>
-      </w:r>
-    </w:p>
-    <w:p>
-      <w:pPr>
-        <w:pStyle w:val="ListParagraph"/>
-        <w:numPr>
-          <w:ilvl w:val="0"/>
-          <w:numId w:val="2"/>
-        </w:numPr>
-      </w:pPr>
-      <w:r>
-        <w:t xml:space="preserve">ProQ-KG: Integrated Cyber-Physical Production System Knowledge Graph for Quality Issue Analysis。</w:t>
-      </w:r>
-    </w:p>
-    <w:p>
-      <w:pPr>
-        <w:pStyle w:val="ListParagraph"/>
-        <w:numPr>
-          <w:ilvl w:val="0"/>
-          <w:numId w:val="2"/>
-        </w:numPr>
-      </w:pPr>
-      <w:r>
-        <w:t xml:space="preserve">Data-driven and Knowledge-based Predictive Maintenance Method for Industrial Robots。</w:t>
+        <w:t xml:space="preserve">飞书开放平台：多维表格新增记录、自定义机器人、Aily技能OpenAPI相关资料。</w:t>
+      </w:r>
+    </w:p>
+    <w:p>
+      <w:pPr>
+        <w:pStyle w:val="ListParagraph"/>
+        <w:numPr>
+          <w:ilvl w:val="0"/>
+          <w:numId w:val="2"/>
+        </w:numPr>
+      </w:pPr>
+      <w:r>
+        <w:t xml:space="preserve">Knollmeyer S, Caymazer O, Grossmann D. Document GraphRAG: Knowledge Graph Enhanced Retrieval Augmented Generation for Document Question Answering Within the Manufacturing Domain. Electronics, 2025.</w:t>
+      </w:r>
+    </w:p>
+    <w:p>
+      <w:pPr>
+        <w:pStyle w:val="ListParagraph"/>
+        <w:numPr>
+          <w:ilvl w:val="0"/>
+          <w:numId w:val="2"/>
+        </w:numPr>
+      </w:pPr>
+      <w:r>
+        <w:t xml:space="preserve">Engineering: An Intelligent Quality Control Method for Manufacturing Processes Based on a Human-Cyber-Physical Knowledge Graph, 2024.</w:t>
+      </w:r>
+    </w:p>
+    <w:p>
+      <w:pPr>
+        <w:pStyle w:val="ListParagraph"/>
+        <w:numPr>
+          <w:ilvl w:val="0"/>
+          <w:numId w:val="2"/>
+        </w:numPr>
+      </w:pPr>
+      <w:r>
+        <w:t xml:space="preserve">ProQ-KG: Integrated Cyber-Physical Production System Knowledge Graph for Quality Issue Analysis, Semantic Web Journal, 2026.</w:t>
+      </w:r>
+    </w:p>
+    <w:p>
+      <w:pPr>
+        <w:pStyle w:val="ListParagraph"/>
+        <w:numPr>
+          <w:ilvl w:val="0"/>
+          <w:numId w:val="2"/>
+        </w:numPr>
+      </w:pPr>
+      <w:r>
+        <w:t xml:space="preserve">Xu Z, Dang Y. Data-driven causal knowledge graph construction for root cause analysis in quality problem solving. International Journal of Production Research, 2023.</w:t>
+      </w:r>
+    </w:p>
+    <w:p>
+      <w:pPr>
+        <w:pStyle w:val="ListParagraph"/>
+        <w:numPr>
+          <w:ilvl w:val="0"/>
+          <w:numId w:val="2"/>
+        </w:numPr>
+      </w:pPr>
+      <w:r>
+        <w:t xml:space="preserve">Microsoft GraphRAG Query Engine documentation.</w:t>
       </w:r>
     </w:p>
     <w:sectPr>

</xml_diff>